<commit_message>
Update with new report as well as with content
</commit_message>
<xml_diff>
--- a/report/ScholarSynth_AI_Project_Report.docx
+++ b/report/ScholarSynth_AI_Project_Report.docx
@@ -238,138 +238,44 @@
     </w:p>
     <w:p>
       <w:pPr>
-        <w:spacing w:before="80" w:after="80"/>
+        <w:spacing w:before="80" w:after="160"/>
+        <w:jc w:val="center"/>
       </w:pPr>
       <w:r>
-        <w:rPr>
-          <w:b/>
-          <w:color w:val="1F4E79"/>
-          <w:sz w:val="19"/>
-        </w:rPr>
-        <w:t>S. No. | Section | Page No.</w:t>
+        <w:drawing>
+          <wp:inline xmlns:a="http://schemas.openxmlformats.org/drawingml/2006/main" xmlns:pic="http://schemas.openxmlformats.org/drawingml/2006/picture">
+            <wp:extent cx="6172200" cy="2740457"/>
+            <wp:docPr id="1" name="Picture 1"/>
+            <wp:cNvGraphicFramePr>
+              <a:graphicFrameLocks noChangeAspect="1"/>
+            </wp:cNvGraphicFramePr>
+            <a:graphic>
+              <a:graphicData uri="http://schemas.openxmlformats.org/drawingml/2006/picture">
+                <pic:pic>
+                  <pic:nvPicPr>
+                    <pic:cNvPr id="0" name="table_01.png"/>
+                    <pic:cNvPicPr/>
+                  </pic:nvPicPr>
+                  <pic:blipFill>
+                    <a:blip r:embed="rId9"/>
+                    <a:stretch>
+                      <a:fillRect/>
+                    </a:stretch>
+                  </pic:blipFill>
+                  <pic:spPr>
+                    <a:xfrm>
+                      <a:off x="0" y="0"/>
+                      <a:ext cx="6172200" cy="2740457"/>
+                    </a:xfrm>
+                    <a:prstGeom prst="rect"/>
+                  </pic:spPr>
+                </pic:pic>
+              </a:graphicData>
+            </a:graphic>
+          </wp:inline>
+        </w:drawing>
       </w:r>
     </w:p>
-    <w:p>
-      <w:pPr>
-        <w:spacing w:after="40"/>
-      </w:pPr>
-      <w:r>
-        <w:rPr>
-          <w:rFonts w:ascii="Courier New" w:hAnsi="Courier New"/>
-          <w:sz w:val="17"/>
-        </w:rPr>
-        <w:t>------ | ------- | --------</w:t>
-      </w:r>
-    </w:p>
-    <w:p>
-      <w:pPr>
-        <w:spacing w:after="40"/>
-        <w:ind w:left="173"/>
-      </w:pPr>
-      <w:r>
-        <w:rPr>
-          <w:sz w:val="18"/>
-        </w:rPr>
-        <w:t>1 | Introduction | 1-2</w:t>
-      </w:r>
-    </w:p>
-    <w:p>
-      <w:pPr>
-        <w:spacing w:after="40"/>
-        <w:ind w:left="173"/>
-      </w:pPr>
-      <w:r>
-        <w:rPr>
-          <w:sz w:val="18"/>
-        </w:rPr>
-        <w:t>2 | Problem Statement | 3-4</w:t>
-      </w:r>
-    </w:p>
-    <w:p>
-      <w:pPr>
-        <w:spacing w:after="40"/>
-        <w:ind w:left="173"/>
-      </w:pPr>
-      <w:r>
-        <w:rPr>
-          <w:sz w:val="18"/>
-        </w:rPr>
-        <w:t>3 | Literature Review | 5-10</w:t>
-      </w:r>
-    </w:p>
-    <w:p>
-      <w:pPr>
-        <w:spacing w:after="40"/>
-        <w:ind w:left="173"/>
-      </w:pPr>
-      <w:r>
-        <w:rPr>
-          <w:sz w:val="18"/>
-        </w:rPr>
-        <w:t>4 | Methodology | 11-15</w:t>
-      </w:r>
-    </w:p>
-    <w:p>
-      <w:pPr>
-        <w:spacing w:after="40"/>
-        <w:ind w:left="173"/>
-      </w:pPr>
-      <w:r>
-        <w:rPr>
-          <w:sz w:val="18"/>
-        </w:rPr>
-        <w:t>5 | Technology Stack | 16</w:t>
-      </w:r>
-    </w:p>
-    <w:p>
-      <w:pPr>
-        <w:spacing w:after="40"/>
-        <w:ind w:left="173"/>
-      </w:pPr>
-      <w:r>
-        <w:rPr>
-          <w:sz w:val="18"/>
-        </w:rPr>
-        <w:t>6 | Results | 17-23</w:t>
-      </w:r>
-    </w:p>
-    <w:p>
-      <w:pPr>
-        <w:spacing w:after="40"/>
-        <w:ind w:left="173"/>
-      </w:pPr>
-      <w:r>
-        <w:rPr>
-          <w:sz w:val="18"/>
-        </w:rPr>
-        <w:t>7 | Conclusions | 24</w:t>
-      </w:r>
-    </w:p>
-    <w:p>
-      <w:pPr>
-        <w:spacing w:after="40"/>
-        <w:ind w:left="173"/>
-      </w:pPr>
-      <w:r>
-        <w:rPr>
-          <w:sz w:val="18"/>
-        </w:rPr>
-        <w:t xml:space="preserve">8 | References | </w:t>
-      </w:r>
-    </w:p>
-    <w:p>
-      <w:pPr>
-        <w:spacing w:after="40"/>
-        <w:ind w:left="173"/>
-      </w:pPr>
-      <w:r>
-        <w:rPr>
-          <w:sz w:val="18"/>
-        </w:rPr>
-        <w:t xml:space="preserve">9 | Appendix | </w:t>
-      </w:r>
-    </w:p>
-    <w:p/>
     <w:p>
       <w:r>
         <w:br w:type="page"/>
@@ -642,114 +548,92 @@
     </w:p>
     <w:p>
       <w:pPr>
-        <w:spacing w:before="80" w:after="80"/>
+        <w:jc w:val="center"/>
       </w:pPr>
       <w:r>
-        <w:rPr>
-          <w:b/>
-          <w:color w:val="1F4E79"/>
-          <w:sz w:val="19"/>
-        </w:rPr>
-        <w:t>Stage | Description</w:t>
+        <w:drawing>
+          <wp:inline xmlns:a="http://schemas.openxmlformats.org/drawingml/2006/main" xmlns:pic="http://schemas.openxmlformats.org/drawingml/2006/picture">
+            <wp:extent cx="6172200" cy="3086100"/>
+            <wp:docPr id="2" name="Picture 2"/>
+            <wp:cNvGraphicFramePr>
+              <a:graphicFrameLocks noChangeAspect="1"/>
+            </wp:cNvGraphicFramePr>
+            <a:graphic>
+              <a:graphicData uri="http://schemas.openxmlformats.org/drawingml/2006/picture">
+                <pic:pic>
+                  <pic:nvPicPr>
+                    <pic:cNvPr id="0" name="project_flowchart.png"/>
+                    <pic:cNvPicPr/>
+                  </pic:nvPicPr>
+                  <pic:blipFill>
+                    <a:blip r:embed="rId10"/>
+                    <a:stretch>
+                      <a:fillRect/>
+                    </a:stretch>
+                  </pic:blipFill>
+                  <pic:spPr>
+                    <a:xfrm>
+                      <a:off x="0" y="0"/>
+                      <a:ext cx="6172200" cy="3086100"/>
+                    </a:xfrm>
+                    <a:prstGeom prst="rect"/>
+                  </pic:spPr>
+                </pic:pic>
+              </a:graphicData>
+            </a:graphic>
+          </wp:inline>
+        </w:drawing>
       </w:r>
     </w:p>
     <w:p>
       <w:pPr>
-        <w:spacing w:after="40"/>
+        <w:spacing w:after="160"/>
+        <w:jc w:val="center"/>
       </w:pPr>
       <w:r>
-        <w:rPr>
-          <w:rFonts w:ascii="Courier New" w:hAnsi="Courier New"/>
-          <w:sz w:val="17"/>
-        </w:rPr>
-        <w:t>------ | -----------</w:t>
+        <w:t>Figure 1: End-to-end ScholarSynth AI workflow.</w:t>
       </w:r>
     </w:p>
     <w:p>
       <w:pPr>
-        <w:spacing w:after="40"/>
-        <w:ind w:left="173"/>
+        <w:spacing w:before="80" w:after="160"/>
+        <w:jc w:val="center"/>
       </w:pPr>
       <w:r>
-        <w:rPr>
-          <w:sz w:val="18"/>
-        </w:rPr>
-        <w:t>Data Collection | Retrieve paper metadata and abstracts from arXiv and Semantic Scholar.</w:t>
+        <w:drawing>
+          <wp:inline xmlns:a="http://schemas.openxmlformats.org/drawingml/2006/main" xmlns:pic="http://schemas.openxmlformats.org/drawingml/2006/picture">
+            <wp:extent cx="6172200" cy="2263140"/>
+            <wp:docPr id="3" name="Picture 3"/>
+            <wp:cNvGraphicFramePr>
+              <a:graphicFrameLocks noChangeAspect="1"/>
+            </wp:cNvGraphicFramePr>
+            <a:graphic>
+              <a:graphicData uri="http://schemas.openxmlformats.org/drawingml/2006/picture">
+                <pic:pic>
+                  <pic:nvPicPr>
+                    <pic:cNvPr id="0" name="table_02.png"/>
+                    <pic:cNvPicPr/>
+                  </pic:nvPicPr>
+                  <pic:blipFill>
+                    <a:blip r:embed="rId11"/>
+                    <a:stretch>
+                      <a:fillRect/>
+                    </a:stretch>
+                  </pic:blipFill>
+                  <pic:spPr>
+                    <a:xfrm>
+                      <a:off x="0" y="0"/>
+                      <a:ext cx="6172200" cy="2263140"/>
+                    </a:xfrm>
+                    <a:prstGeom prst="rect"/>
+                  </pic:spPr>
+                </pic:pic>
+              </a:graphicData>
+            </a:graphic>
+          </wp:inline>
+        </w:drawing>
       </w:r>
     </w:p>
-    <w:p>
-      <w:pPr>
-        <w:spacing w:after="40"/>
-        <w:ind w:left="173"/>
-      </w:pPr>
-      <w:r>
-        <w:rPr>
-          <w:sz w:val="18"/>
-        </w:rPr>
-        <w:t>Preprocessing | Clean text, remove duplicates, normalize fields, and chunk title plus abstract text.</w:t>
-      </w:r>
-    </w:p>
-    <w:p>
-      <w:pPr>
-        <w:spacing w:after="40"/>
-        <w:ind w:left="173"/>
-      </w:pPr>
-      <w:r>
-        <w:rPr>
-          <w:sz w:val="18"/>
-        </w:rPr>
-        <w:t>Storage | Store metadata in SQLite and vector embeddings in ChromaDB.</w:t>
-      </w:r>
-    </w:p>
-    <w:p>
-      <w:pPr>
-        <w:spacing w:after="40"/>
-        <w:ind w:left="173"/>
-      </w:pPr>
-      <w:r>
-        <w:rPr>
-          <w:sz w:val="18"/>
-        </w:rPr>
-        <w:t>Retrieval | Use semantic search to retrieve relevant paper chunks for a user query.</w:t>
-      </w:r>
-    </w:p>
-    <w:p>
-      <w:pPr>
-        <w:spacing w:after="40"/>
-        <w:ind w:left="173"/>
-      </w:pPr>
-      <w:r>
-        <w:rPr>
-          <w:sz w:val="18"/>
-        </w:rPr>
-        <w:t>Generation | Use FLAN-T5 and RAG prompts to generate summaries, reviews, answers, and gaps.</w:t>
-      </w:r>
-    </w:p>
-    <w:p>
-      <w:pPr>
-        <w:spacing w:after="40"/>
-        <w:ind w:left="173"/>
-      </w:pPr>
-      <w:r>
-        <w:rPr>
-          <w:sz w:val="18"/>
-        </w:rPr>
-        <w:t>Fine-Tuning | Apply LoRA to FLAN-T5 using academic task examples.</w:t>
-      </w:r>
-    </w:p>
-    <w:p>
-      <w:pPr>
-        <w:spacing w:after="40"/>
-        <w:ind w:left="173"/>
-      </w:pPr>
-      <w:r>
-        <w:rPr>
-          <w:sz w:val="18"/>
-        </w:rPr>
-        <w:t>Evaluation | Compare systems using BLEU, ROUGE, and BERTScore.</w:t>
-      </w:r>
-    </w:p>
-    <w:p/>
     <w:p>
       <w:pPr>
         <w:pStyle w:val="Heading2"/>
@@ -771,90 +655,44 @@
     </w:p>
     <w:p>
       <w:pPr>
-        <w:spacing w:before="80" w:after="80"/>
+        <w:spacing w:before="80" w:after="160"/>
+        <w:jc w:val="center"/>
       </w:pPr>
       <w:r>
-        <w:rPr>
-          <w:b/>
-          <w:color w:val="1F4E79"/>
-          <w:sz w:val="19"/>
-        </w:rPr>
-        <w:t>Dataset File | Count</w:t>
+        <w:drawing>
+          <wp:inline xmlns:a="http://schemas.openxmlformats.org/drawingml/2006/main" xmlns:pic="http://schemas.openxmlformats.org/drawingml/2006/picture">
+            <wp:extent cx="6172200" cy="1785823"/>
+            <wp:docPr id="4" name="Picture 4"/>
+            <wp:cNvGraphicFramePr>
+              <a:graphicFrameLocks noChangeAspect="1"/>
+            </wp:cNvGraphicFramePr>
+            <a:graphic>
+              <a:graphicData uri="http://schemas.openxmlformats.org/drawingml/2006/picture">
+                <pic:pic>
+                  <pic:nvPicPr>
+                    <pic:cNvPr id="0" name="table_03.png"/>
+                    <pic:cNvPicPr/>
+                  </pic:nvPicPr>
+                  <pic:blipFill>
+                    <a:blip r:embed="rId12"/>
+                    <a:stretch>
+                      <a:fillRect/>
+                    </a:stretch>
+                  </pic:blipFill>
+                  <pic:spPr>
+                    <a:xfrm>
+                      <a:off x="0" y="0"/>
+                      <a:ext cx="6172200" cy="1785823"/>
+                    </a:xfrm>
+                    <a:prstGeom prst="rect"/>
+                  </pic:spPr>
+                </pic:pic>
+              </a:graphicData>
+            </a:graphic>
+          </wp:inline>
+        </w:drawing>
       </w:r>
     </w:p>
-    <w:p>
-      <w:pPr>
-        <w:spacing w:after="40"/>
-      </w:pPr>
-      <w:r>
-        <w:rPr>
-          <w:rFonts w:ascii="Courier New" w:hAnsi="Courier New"/>
-          <w:sz w:val="17"/>
-        </w:rPr>
-        <w:t>------------ | ------</w:t>
-      </w:r>
-    </w:p>
-    <w:p>
-      <w:pPr>
-        <w:spacing w:after="40"/>
-        <w:ind w:left="173"/>
-      </w:pPr>
-      <w:r>
-        <w:rPr>
-          <w:sz w:val="18"/>
-        </w:rPr>
-        <w:t>Raw papers | 5,000 papers</w:t>
-      </w:r>
-    </w:p>
-    <w:p>
-      <w:pPr>
-        <w:spacing w:after="40"/>
-        <w:ind w:left="173"/>
-      </w:pPr>
-      <w:r>
-        <w:rPr>
-          <w:sz w:val="18"/>
-        </w:rPr>
-        <w:t>Processed chunks | 10,339 chunks</w:t>
-      </w:r>
-    </w:p>
-    <w:p>
-      <w:pPr>
-        <w:spacing w:after="40"/>
-        <w:ind w:left="173"/>
-      </w:pPr>
-      <w:r>
-        <w:rPr>
-          <w:sz w:val="18"/>
-        </w:rPr>
-        <w:t>Fine-tuning examples | 8,631 examples</w:t>
-      </w:r>
-    </w:p>
-    <w:p>
-      <w:pPr>
-        <w:spacing w:after="40"/>
-        <w:ind w:left="173"/>
-      </w:pPr>
-      <w:r>
-        <w:rPr>
-          <w:sz w:val="18"/>
-        </w:rPr>
-        <w:t>Topics covered | 94 topics</w:t>
-      </w:r>
-    </w:p>
-    <w:p>
-      <w:pPr>
-        <w:spacing w:after="40"/>
-        <w:ind w:left="173"/>
-      </w:pPr>
-      <w:r>
-        <w:rPr>
-          <w:sz w:val="18"/>
-        </w:rPr>
-        <w:t>Source split | 4,673 arXiv papers and 327 Semantic Scholar papers</w:t>
-      </w:r>
-    </w:p>
-    <w:p/>
     <w:p>
       <w:pPr>
         <w:pStyle w:val="Heading2"/>
@@ -876,66 +714,44 @@
     </w:p>
     <w:p>
       <w:pPr>
-        <w:spacing w:before="80" w:after="80"/>
+        <w:spacing w:before="80" w:after="160"/>
+        <w:jc w:val="center"/>
       </w:pPr>
       <w:r>
-        <w:rPr>
-          <w:b/>
-          <w:color w:val="1F4E79"/>
-          <w:sz w:val="19"/>
-        </w:rPr>
-        <w:t>Split | Chunk Rows | Fine-Tuning Examples</w:t>
+        <w:drawing>
+          <wp:inline xmlns:a="http://schemas.openxmlformats.org/drawingml/2006/main" xmlns:pic="http://schemas.openxmlformats.org/drawingml/2006/picture">
+            <wp:extent cx="6172200" cy="1308506"/>
+            <wp:docPr id="5" name="Picture 5"/>
+            <wp:cNvGraphicFramePr>
+              <a:graphicFrameLocks noChangeAspect="1"/>
+            </wp:cNvGraphicFramePr>
+            <a:graphic>
+              <a:graphicData uri="http://schemas.openxmlformats.org/drawingml/2006/picture">
+                <pic:pic>
+                  <pic:nvPicPr>
+                    <pic:cNvPr id="0" name="table_04.png"/>
+                    <pic:cNvPicPr/>
+                  </pic:nvPicPr>
+                  <pic:blipFill>
+                    <a:blip r:embed="rId13"/>
+                    <a:stretch>
+                      <a:fillRect/>
+                    </a:stretch>
+                  </pic:blipFill>
+                  <pic:spPr>
+                    <a:xfrm>
+                      <a:off x="0" y="0"/>
+                      <a:ext cx="6172200" cy="1308506"/>
+                    </a:xfrm>
+                    <a:prstGeom prst="rect"/>
+                  </pic:spPr>
+                </pic:pic>
+              </a:graphicData>
+            </a:graphic>
+          </wp:inline>
+        </w:drawing>
       </w:r>
     </w:p>
-    <w:p>
-      <w:pPr>
-        <w:spacing w:after="40"/>
-      </w:pPr>
-      <w:r>
-        <w:rPr>
-          <w:rFonts w:ascii="Courier New" w:hAnsi="Courier New"/>
-          <w:sz w:val="17"/>
-        </w:rPr>
-        <w:t>------ | ---------- | --------------------</w:t>
-      </w:r>
-    </w:p>
-    <w:p>
-      <w:pPr>
-        <w:spacing w:after="40"/>
-        <w:ind w:left="173"/>
-      </w:pPr>
-      <w:r>
-        <w:rPr>
-          <w:sz w:val="18"/>
-        </w:rPr>
-        <w:t>Training | 7,754 | 6,473</w:t>
-      </w:r>
-    </w:p>
-    <w:p>
-      <w:pPr>
-        <w:spacing w:after="40"/>
-        <w:ind w:left="173"/>
-      </w:pPr>
-      <w:r>
-        <w:rPr>
-          <w:sz w:val="18"/>
-        </w:rPr>
-        <w:t>Validation | 1,034 | 863</w:t>
-      </w:r>
-    </w:p>
-    <w:p>
-      <w:pPr>
-        <w:spacing w:after="40"/>
-        <w:ind w:left="173"/>
-      </w:pPr>
-      <w:r>
-        <w:rPr>
-          <w:sz w:val="18"/>
-        </w:rPr>
-        <w:t>Testing | 1,551 | 1,295</w:t>
-      </w:r>
-    </w:p>
-    <w:p/>
     <w:p>
       <w:pPr>
         <w:pStyle w:val="Heading2"/>
@@ -1008,78 +824,44 @@
     </w:p>
     <w:p>
       <w:pPr>
-        <w:spacing w:before="80" w:after="80"/>
+        <w:spacing w:before="80" w:after="160"/>
+        <w:jc w:val="center"/>
       </w:pPr>
       <w:r>
-        <w:rPr>
-          <w:b/>
-          <w:color w:val="1F4E79"/>
-          <w:sz w:val="19"/>
-        </w:rPr>
-        <w:t>Agent | Responsibility</w:t>
+        <w:drawing>
+          <wp:inline xmlns:a="http://schemas.openxmlformats.org/drawingml/2006/main" xmlns:pic="http://schemas.openxmlformats.org/drawingml/2006/picture">
+            <wp:extent cx="6172200" cy="1547165"/>
+            <wp:docPr id="6" name="Picture 6"/>
+            <wp:cNvGraphicFramePr>
+              <a:graphicFrameLocks noChangeAspect="1"/>
+            </wp:cNvGraphicFramePr>
+            <a:graphic>
+              <a:graphicData uri="http://schemas.openxmlformats.org/drawingml/2006/picture">
+                <pic:pic>
+                  <pic:nvPicPr>
+                    <pic:cNvPr id="0" name="table_05.png"/>
+                    <pic:cNvPicPr/>
+                  </pic:nvPicPr>
+                  <pic:blipFill>
+                    <a:blip r:embed="rId14"/>
+                    <a:stretch>
+                      <a:fillRect/>
+                    </a:stretch>
+                  </pic:blipFill>
+                  <pic:spPr>
+                    <a:xfrm>
+                      <a:off x="0" y="0"/>
+                      <a:ext cx="6172200" cy="1547165"/>
+                    </a:xfrm>
+                    <a:prstGeom prst="rect"/>
+                  </pic:spPr>
+                </pic:pic>
+              </a:graphicData>
+            </a:graphic>
+          </wp:inline>
+        </w:drawing>
       </w:r>
     </w:p>
-    <w:p>
-      <w:pPr>
-        <w:spacing w:after="40"/>
-      </w:pPr>
-      <w:r>
-        <w:rPr>
-          <w:rFonts w:ascii="Courier New" w:hAnsi="Courier New"/>
-          <w:sz w:val="17"/>
-        </w:rPr>
-        <w:t>------ | --------------</w:t>
-      </w:r>
-    </w:p>
-    <w:p>
-      <w:pPr>
-        <w:spacing w:after="40"/>
-        <w:ind w:left="173"/>
-      </w:pPr>
-      <w:r>
-        <w:rPr>
-          <w:sz w:val="18"/>
-        </w:rPr>
-        <w:t>LiteratureReviewAgent | Generates structured literature reviews from retrieved evidence.</w:t>
-      </w:r>
-    </w:p>
-    <w:p>
-      <w:pPr>
-        <w:spacing w:after="40"/>
-        <w:ind w:left="173"/>
-      </w:pPr>
-      <w:r>
-        <w:rPr>
-          <w:sz w:val="18"/>
-        </w:rPr>
-        <w:t>ResearchGapAgent | Identifies limitations, gaps, and future research directions.</w:t>
-      </w:r>
-    </w:p>
-    <w:p>
-      <w:pPr>
-        <w:spacing w:after="40"/>
-        <w:ind w:left="173"/>
-      </w:pPr>
-      <w:r>
-        <w:rPr>
-          <w:sz w:val="18"/>
-        </w:rPr>
-        <w:t>TechnicalExplainerAgent | Explains complex methods and models in simpler language.</w:t>
-      </w:r>
-    </w:p>
-    <w:p>
-      <w:pPr>
-        <w:spacing w:after="40"/>
-        <w:ind w:left="173"/>
-      </w:pPr>
-      <w:r>
-        <w:rPr>
-          <w:sz w:val="18"/>
-        </w:rPr>
-        <w:t>GuardrailAgent | Validates input and output to reduce invalid queries and unsupported responses.</w:t>
-      </w:r>
-    </w:p>
-    <w:p/>
     <w:p>
       <w:pPr>
         <w:pStyle w:val="Heading1"/>
@@ -1093,150 +875,44 @@
     </w:p>
     <w:p>
       <w:pPr>
-        <w:spacing w:before="80" w:after="80"/>
+        <w:spacing w:before="80" w:after="160"/>
+        <w:jc w:val="center"/>
       </w:pPr>
       <w:r>
-        <w:rPr>
-          <w:b/>
-          <w:color w:val="1F4E79"/>
-          <w:sz w:val="19"/>
-        </w:rPr>
-        <w:t>Component | Technology Used | Purpose</w:t>
+        <w:drawing>
+          <wp:inline xmlns:a="http://schemas.openxmlformats.org/drawingml/2006/main" xmlns:pic="http://schemas.openxmlformats.org/drawingml/2006/picture">
+            <wp:extent cx="6172200" cy="3102559"/>
+            <wp:docPr id="7" name="Picture 7"/>
+            <wp:cNvGraphicFramePr>
+              <a:graphicFrameLocks noChangeAspect="1"/>
+            </wp:cNvGraphicFramePr>
+            <a:graphic>
+              <a:graphicData uri="http://schemas.openxmlformats.org/drawingml/2006/picture">
+                <pic:pic>
+                  <pic:nvPicPr>
+                    <pic:cNvPr id="0" name="table_06.png"/>
+                    <pic:cNvPicPr/>
+                  </pic:nvPicPr>
+                  <pic:blipFill>
+                    <a:blip r:embed="rId15"/>
+                    <a:stretch>
+                      <a:fillRect/>
+                    </a:stretch>
+                  </pic:blipFill>
+                  <pic:spPr>
+                    <a:xfrm>
+                      <a:off x="0" y="0"/>
+                      <a:ext cx="6172200" cy="3102559"/>
+                    </a:xfrm>
+                    <a:prstGeom prst="rect"/>
+                  </pic:spPr>
+                </pic:pic>
+              </a:graphicData>
+            </a:graphic>
+          </wp:inline>
+        </w:drawing>
       </w:r>
     </w:p>
-    <w:p>
-      <w:pPr>
-        <w:spacing w:after="40"/>
-      </w:pPr>
-      <w:r>
-        <w:rPr>
-          <w:rFonts w:ascii="Courier New" w:hAnsi="Courier New"/>
-          <w:sz w:val="17"/>
-        </w:rPr>
-        <w:t>--------- | --------------- | -------</w:t>
-      </w:r>
-    </w:p>
-    <w:p>
-      <w:pPr>
-        <w:spacing w:after="40"/>
-        <w:ind w:left="173"/>
-      </w:pPr>
-      <w:r>
-        <w:rPr>
-          <w:sz w:val="18"/>
-        </w:rPr>
-        <w:t>Programming Language | Python | Core implementation and notebooks.</w:t>
-      </w:r>
-    </w:p>
-    <w:p>
-      <w:pPr>
-        <w:spacing w:after="40"/>
-        <w:ind w:left="173"/>
-      </w:pPr>
-      <w:r>
-        <w:rPr>
-          <w:sz w:val="18"/>
-        </w:rPr>
-        <w:t>Frontend | Streamlit | Interactive user interface.</w:t>
-      </w:r>
-    </w:p>
-    <w:p>
-      <w:pPr>
-        <w:spacing w:after="40"/>
-        <w:ind w:left="173"/>
-      </w:pPr>
-      <w:r>
-        <w:rPr>
-          <w:sz w:val="18"/>
-        </w:rPr>
-        <w:t>Paper Sources | arXiv API, Semantic Scholar API | Research paper retrieval.</w:t>
-      </w:r>
-    </w:p>
-    <w:p>
-      <w:pPr>
-        <w:spacing w:after="40"/>
-        <w:ind w:left="173"/>
-      </w:pPr>
-      <w:r>
-        <w:rPr>
-          <w:sz w:val="18"/>
-        </w:rPr>
-        <w:t>Metadata DB | SQLite | Structured paper metadata storage.</w:t>
-      </w:r>
-    </w:p>
-    <w:p>
-      <w:pPr>
-        <w:spacing w:after="40"/>
-        <w:ind w:left="173"/>
-      </w:pPr>
-      <w:r>
-        <w:rPr>
-          <w:sz w:val="18"/>
-        </w:rPr>
-        <w:t>Vector DB | ChromaDB | Persistent semantic search over embeddings.</w:t>
-      </w:r>
-    </w:p>
-    <w:p>
-      <w:pPr>
-        <w:spacing w:after="40"/>
-        <w:ind w:left="173"/>
-      </w:pPr>
-      <w:r>
-        <w:rPr>
-          <w:sz w:val="18"/>
-        </w:rPr>
-        <w:t>Embedding Model | sentence-transformers/all-MiniLM-L6-v2 | Generate dense text embeddings.</w:t>
-      </w:r>
-    </w:p>
-    <w:p>
-      <w:pPr>
-        <w:spacing w:after="40"/>
-        <w:ind w:left="173"/>
-      </w:pPr>
-      <w:r>
-        <w:rPr>
-          <w:sz w:val="18"/>
-        </w:rPr>
-        <w:t>Base Model | google/flan-t5-base | Text generation baseline.</w:t>
-      </w:r>
-    </w:p>
-    <w:p>
-      <w:pPr>
-        <w:spacing w:after="40"/>
-        <w:ind w:left="173"/>
-      </w:pPr>
-      <w:r>
-        <w:rPr>
-          <w:sz w:val="18"/>
-        </w:rPr>
-        <w:t>Fine-Tuning | PEFT LoRA | Parameter-efficient domain adaptation.</w:t>
-      </w:r>
-    </w:p>
-    <w:p>
-      <w:pPr>
-        <w:spacing w:after="40"/>
-        <w:ind w:left="173"/>
-      </w:pPr>
-      <w:r>
-        <w:rPr>
-          <w:sz w:val="18"/>
-        </w:rPr>
-        <w:t>Training Platform | Google Colab | GPU-based fine-tuning.</w:t>
-      </w:r>
-    </w:p>
-    <w:p>
-      <w:pPr>
-        <w:spacing w:after="40"/>
-        <w:ind w:left="173"/>
-      </w:pPr>
-      <w:r>
-        <w:rPr>
-          <w:sz w:val="18"/>
-        </w:rPr>
-        <w:t>Evaluation | BLEU, ROUGE, BERTScore | Quantitative generation comparison.</w:t>
-      </w:r>
-    </w:p>
-    <w:p/>
     <w:p>
       <w:pPr>
         <w:pStyle w:val="Heading1"/>
@@ -1288,66 +964,44 @@
     </w:p>
     <w:p>
       <w:pPr>
-        <w:spacing w:before="80" w:after="80"/>
+        <w:spacing w:before="80" w:after="160"/>
+        <w:jc w:val="center"/>
       </w:pPr>
       <w:r>
-        <w:rPr>
-          <w:b/>
-          <w:color w:val="1F4E79"/>
-          <w:sz w:val="19"/>
-        </w:rPr>
-        <w:t>Model | BLEU | ROUGE-1 | ROUGE-2 | ROUGE-L | BERTScore F1</w:t>
+        <w:drawing>
+          <wp:inline xmlns:a="http://schemas.openxmlformats.org/drawingml/2006/main" xmlns:pic="http://schemas.openxmlformats.org/drawingml/2006/picture">
+            <wp:extent cx="6172200" cy="1308506"/>
+            <wp:docPr id="8" name="Picture 8"/>
+            <wp:cNvGraphicFramePr>
+              <a:graphicFrameLocks noChangeAspect="1"/>
+            </wp:cNvGraphicFramePr>
+            <a:graphic>
+              <a:graphicData uri="http://schemas.openxmlformats.org/drawingml/2006/picture">
+                <pic:pic>
+                  <pic:nvPicPr>
+                    <pic:cNvPr id="0" name="table_07.png"/>
+                    <pic:cNvPicPr/>
+                  </pic:nvPicPr>
+                  <pic:blipFill>
+                    <a:blip r:embed="rId16"/>
+                    <a:stretch>
+                      <a:fillRect/>
+                    </a:stretch>
+                  </pic:blipFill>
+                  <pic:spPr>
+                    <a:xfrm>
+                      <a:off x="0" y="0"/>
+                      <a:ext cx="6172200" cy="1308506"/>
+                    </a:xfrm>
+                    <a:prstGeom prst="rect"/>
+                  </pic:spPr>
+                </pic:pic>
+              </a:graphicData>
+            </a:graphic>
+          </wp:inline>
+        </w:drawing>
       </w:r>
     </w:p>
-    <w:p>
-      <w:pPr>
-        <w:spacing w:after="40"/>
-      </w:pPr>
-      <w:r>
-        <w:rPr>
-          <w:rFonts w:ascii="Courier New" w:hAnsi="Courier New"/>
-          <w:sz w:val="17"/>
-        </w:rPr>
-        <w:t>------ | ------ | ------- | ------- | ------- | ------------</w:t>
-      </w:r>
-    </w:p>
-    <w:p>
-      <w:pPr>
-        <w:spacing w:after="40"/>
-        <w:ind w:left="173"/>
-      </w:pPr>
-      <w:r>
-        <w:rPr>
-          <w:sz w:val="18"/>
-        </w:rPr>
-        <w:t>pretrained | 0.0117 | 0.2100 | 0.1011 | 0.1675 | 0.7849</w:t>
-      </w:r>
-    </w:p>
-    <w:p>
-      <w:pPr>
-        <w:spacing w:after="40"/>
-        <w:ind w:left="173"/>
-      </w:pPr>
-      <w:r>
-        <w:rPr>
-          <w:sz w:val="18"/>
-        </w:rPr>
-        <w:t>rag_system | 0.0116 | 0.1649 | 0.0749 | 0.1355 | 0.7632</w:t>
-      </w:r>
-    </w:p>
-    <w:p>
-      <w:pPr>
-        <w:spacing w:after="40"/>
-        <w:ind w:left="173"/>
-      </w:pPr>
-      <w:r>
-        <w:rPr>
-          <w:sz w:val="18"/>
-        </w:rPr>
-        <w:t>prompt_engineered | 0.0026 | 0.1384 | 0.0727 | 0.1200 | 0.7537</w:t>
-      </w:r>
-    </w:p>
-    <w:p/>
     <w:p>
       <w:pPr>
         <w:spacing w:after="120" w:line="259" w:lineRule="auto"/>
@@ -1377,90 +1031,44 @@
     </w:p>
     <w:p>
       <w:pPr>
-        <w:spacing w:before="80" w:after="80"/>
+        <w:spacing w:before="80" w:after="160"/>
+        <w:jc w:val="center"/>
       </w:pPr>
       <w:r>
-        <w:rPr>
-          <w:b/>
-          <w:color w:val="1F4E79"/>
-          <w:sz w:val="19"/>
-        </w:rPr>
-        <w:t>System | Status</w:t>
+        <w:drawing>
+          <wp:inline xmlns:a="http://schemas.openxmlformats.org/drawingml/2006/main" xmlns:pic="http://schemas.openxmlformats.org/drawingml/2006/picture">
+            <wp:extent cx="6172200" cy="1785823"/>
+            <wp:docPr id="9" name="Picture 9"/>
+            <wp:cNvGraphicFramePr>
+              <a:graphicFrameLocks noChangeAspect="1"/>
+            </wp:cNvGraphicFramePr>
+            <a:graphic>
+              <a:graphicData uri="http://schemas.openxmlformats.org/drawingml/2006/picture">
+                <pic:pic>
+                  <pic:nvPicPr>
+                    <pic:cNvPr id="0" name="table_08.png"/>
+                    <pic:cNvPicPr/>
+                  </pic:nvPicPr>
+                  <pic:blipFill>
+                    <a:blip r:embed="rId17"/>
+                    <a:stretch>
+                      <a:fillRect/>
+                    </a:stretch>
+                  </pic:blipFill>
+                  <pic:spPr>
+                    <a:xfrm>
+                      <a:off x="0" y="0"/>
+                      <a:ext cx="6172200" cy="1785823"/>
+                    </a:xfrm>
+                    <a:prstGeom prst="rect"/>
+                  </pic:spPr>
+                </pic:pic>
+              </a:graphicData>
+            </a:graphic>
+          </wp:inline>
+        </w:drawing>
       </w:r>
     </w:p>
-    <w:p>
-      <w:pPr>
-        <w:spacing w:after="40"/>
-      </w:pPr>
-      <w:r>
-        <w:rPr>
-          <w:rFonts w:ascii="Courier New" w:hAnsi="Courier New"/>
-          <w:sz w:val="17"/>
-        </w:rPr>
-        <w:t>------ | ------</w:t>
-      </w:r>
-    </w:p>
-    <w:p>
-      <w:pPr>
-        <w:spacing w:after="40"/>
-        <w:ind w:left="173"/>
-      </w:pPr>
-      <w:r>
-        <w:rPr>
-          <w:sz w:val="18"/>
-        </w:rPr>
-        <w:t>pretrained FLAN-T5 | Baseline evaluated on 200 examples.</w:t>
-      </w:r>
-    </w:p>
-    <w:p>
-      <w:pPr>
-        <w:spacing w:after="40"/>
-        <w:ind w:left="173"/>
-      </w:pPr>
-      <w:r>
-        <w:rPr>
-          <w:sz w:val="18"/>
-        </w:rPr>
-        <w:t>prompt-engineered FLAN-T5 | Baseline evaluated on 200 examples.</w:t>
-      </w:r>
-    </w:p>
-    <w:p>
-      <w:pPr>
-        <w:spacing w:after="40"/>
-        <w:ind w:left="173"/>
-      </w:pPr>
-      <w:r>
-        <w:rPr>
-          <w:sz w:val="18"/>
-        </w:rPr>
-        <w:t>RAG system | Baseline evaluated on 200 examples.</w:t>
-      </w:r>
-    </w:p>
-    <w:p>
-      <w:pPr>
-        <w:spacing w:after="40"/>
-        <w:ind w:left="173"/>
-      </w:pPr>
-      <w:r>
-        <w:rPr>
-          <w:sz w:val="18"/>
-        </w:rPr>
-        <w:t>fine-tuned LoRA model | Adapter trained; final 200-example evaluation pending.</w:t>
-      </w:r>
-    </w:p>
-    <w:p>
-      <w:pPr>
-        <w:spacing w:after="40"/>
-        <w:ind w:left="173"/>
-      </w:pPr>
-      <w:r>
-        <w:rPr>
-          <w:sz w:val="18"/>
-        </w:rPr>
-        <w:t>RAG + LoRA model | Notebook prepared; final 200-example evaluation pending.</w:t>
-      </w:r>
-    </w:p>
-    <w:p/>
     <w:p>
       <w:pPr>
         <w:pStyle w:val="Heading2"/>
@@ -1482,90 +1090,44 @@
     </w:p>
     <w:p>
       <w:pPr>
-        <w:spacing w:before="80" w:after="80"/>
+        <w:spacing w:before="80" w:after="160"/>
+        <w:jc w:val="center"/>
       </w:pPr>
       <w:r>
-        <w:rPr>
-          <w:b/>
-          <w:color w:val="1F4E79"/>
-          <w:sz w:val="19"/>
-        </w:rPr>
-        <w:t>Failure Case | Description | Mitigation</w:t>
+        <w:drawing>
+          <wp:inline xmlns:a="http://schemas.openxmlformats.org/drawingml/2006/main" xmlns:pic="http://schemas.openxmlformats.org/drawingml/2006/picture">
+            <wp:extent cx="6172200" cy="2403043"/>
+            <wp:docPr id="10" name="Picture 10"/>
+            <wp:cNvGraphicFramePr>
+              <a:graphicFrameLocks noChangeAspect="1"/>
+            </wp:cNvGraphicFramePr>
+            <a:graphic>
+              <a:graphicData uri="http://schemas.openxmlformats.org/drawingml/2006/picture">
+                <pic:pic>
+                  <pic:nvPicPr>
+                    <pic:cNvPr id="0" name="table_09.png"/>
+                    <pic:cNvPicPr/>
+                  </pic:nvPicPr>
+                  <pic:blipFill>
+                    <a:blip r:embed="rId18"/>
+                    <a:stretch>
+                      <a:fillRect/>
+                    </a:stretch>
+                  </pic:blipFill>
+                  <pic:spPr>
+                    <a:xfrm>
+                      <a:off x="0" y="0"/>
+                      <a:ext cx="6172200" cy="2403043"/>
+                    </a:xfrm>
+                    <a:prstGeom prst="rect"/>
+                  </pic:spPr>
+                </pic:pic>
+              </a:graphicData>
+            </a:graphic>
+          </wp:inline>
+        </w:drawing>
       </w:r>
     </w:p>
-    <w:p>
-      <w:pPr>
-        <w:spacing w:after="40"/>
-      </w:pPr>
-      <w:r>
-        <w:rPr>
-          <w:rFonts w:ascii="Courier New" w:hAnsi="Courier New"/>
-          <w:sz w:val="17"/>
-        </w:rPr>
-        <w:t>------------ | ----------- | ----------</w:t>
-      </w:r>
-    </w:p>
-    <w:p>
-      <w:pPr>
-        <w:spacing w:after="40"/>
-        <w:ind w:left="173"/>
-      </w:pPr>
-      <w:r>
-        <w:rPr>
-          <w:sz w:val="18"/>
-        </w:rPr>
-        <w:t>Hallucinated citation | Model may invent paper titles or unsupported claims. | Use RAG evidence and fake-citation checks.</w:t>
-      </w:r>
-    </w:p>
-    <w:p>
-      <w:pPr>
-        <w:spacing w:after="40"/>
-        <w:ind w:left="173"/>
-      </w:pPr>
-      <w:r>
-        <w:rPr>
-          <w:sz w:val="18"/>
-        </w:rPr>
-        <w:t>Irrelevant retrieval | Vector search may retrieve loosely related papers. | Use topic-aware query construction and top-k review.</w:t>
-      </w:r>
-    </w:p>
-    <w:p>
-      <w:pPr>
-        <w:spacing w:after="40"/>
-        <w:ind w:left="173"/>
-      </w:pPr>
-      <w:r>
-        <w:rPr>
-          <w:sz w:val="18"/>
-        </w:rPr>
-        <w:t>Generic answer | Pretrained model may produce broad academic text. | Use LoRA fine-tuning and task-specific prompts.</w:t>
-      </w:r>
-    </w:p>
-    <w:p>
-      <w:pPr>
-        <w:spacing w:after="40"/>
-        <w:ind w:left="173"/>
-      </w:pPr>
-      <w:r>
-        <w:rPr>
-          <w:sz w:val="18"/>
-        </w:rPr>
-        <w:t>Weak gap analysis | Model may list obvious gaps without evidence. | Require retrieved evidence and source titles.</w:t>
-      </w:r>
-    </w:p>
-    <w:p>
-      <w:pPr>
-        <w:spacing w:after="40"/>
-        <w:ind w:left="173"/>
-      </w:pPr>
-      <w:r>
-        <w:rPr>
-          <w:sz w:val="18"/>
-        </w:rPr>
-        <w:t>Repetition | Generation may repeat phrases on long prompts. | Clean generations and limit answer length.</w:t>
-      </w:r>
-    </w:p>
-    <w:p/>
     <w:p>
       <w:pPr>
         <w:pStyle w:val="Heading2"/>
@@ -1770,150 +1332,44 @@
     </w:p>
     <w:p>
       <w:pPr>
-        <w:spacing w:before="80" w:after="80"/>
+        <w:spacing w:before="80" w:after="160"/>
+        <w:jc w:val="center"/>
       </w:pPr>
       <w:r>
-        <w:rPr>
-          <w:b/>
-          <w:color w:val="1F4E79"/>
-          <w:sz w:val="19"/>
-        </w:rPr>
-        <w:t>File or Folder | Purpose</w:t>
+        <w:drawing>
+          <wp:inline xmlns:a="http://schemas.openxmlformats.org/drawingml/2006/main" xmlns:pic="http://schemas.openxmlformats.org/drawingml/2006/picture">
+            <wp:extent cx="6172200" cy="3226003"/>
+            <wp:docPr id="11" name="Picture 11"/>
+            <wp:cNvGraphicFramePr>
+              <a:graphicFrameLocks noChangeAspect="1"/>
+            </wp:cNvGraphicFramePr>
+            <a:graphic>
+              <a:graphicData uri="http://schemas.openxmlformats.org/drawingml/2006/picture">
+                <pic:pic>
+                  <pic:nvPicPr>
+                    <pic:cNvPr id="0" name="table_10.png"/>
+                    <pic:cNvPicPr/>
+                  </pic:nvPicPr>
+                  <pic:blipFill>
+                    <a:blip r:embed="rId19"/>
+                    <a:stretch>
+                      <a:fillRect/>
+                    </a:stretch>
+                  </pic:blipFill>
+                  <pic:spPr>
+                    <a:xfrm>
+                      <a:off x="0" y="0"/>
+                      <a:ext cx="6172200" cy="3226003"/>
+                    </a:xfrm>
+                    <a:prstGeom prst="rect"/>
+                  </pic:spPr>
+                </pic:pic>
+              </a:graphicData>
+            </a:graphic>
+          </wp:inline>
+        </w:drawing>
       </w:r>
     </w:p>
-    <w:p>
-      <w:pPr>
-        <w:spacing w:after="40"/>
-      </w:pPr>
-      <w:r>
-        <w:rPr>
-          <w:rFonts w:ascii="Courier New" w:hAnsi="Courier New"/>
-          <w:sz w:val="17"/>
-        </w:rPr>
-        <w:t>-------------- | -------</w:t>
-      </w:r>
-    </w:p>
-    <w:p>
-      <w:pPr>
-        <w:spacing w:after="40"/>
-        <w:ind w:left="173"/>
-      </w:pPr>
-      <w:r>
-        <w:rPr>
-          <w:sz w:val="18"/>
-        </w:rPr>
-        <w:t>data/ | Raw papers, processed chunks, train/validation/test splits, and fine-tuning JSONL files.</w:t>
-      </w:r>
-    </w:p>
-    <w:p>
-      <w:pPr>
-        <w:spacing w:after="40"/>
-        <w:ind w:left="173"/>
-      </w:pPr>
-      <w:r>
-        <w:rPr>
-          <w:sz w:val="18"/>
-        </w:rPr>
-        <w:t>notebooks/ | Step-wise notebooks for data collection, vector DB, baseline comparison, fine-tuning, and final comparison.</w:t>
-      </w:r>
-    </w:p>
-    <w:p>
-      <w:pPr>
-        <w:spacing w:after="40"/>
-        <w:ind w:left="173"/>
-      </w:pPr>
-      <w:r>
-        <w:rPr>
-          <w:sz w:val="18"/>
-        </w:rPr>
-        <w:t>src/paper_search.py | arXiv and Semantic Scholar paper retrieval.</w:t>
-      </w:r>
-    </w:p>
-    <w:p>
-      <w:pPr>
-        <w:spacing w:after="40"/>
-        <w:ind w:left="173"/>
-      </w:pPr>
-      <w:r>
-        <w:rPr>
-          <w:sz w:val="18"/>
-        </w:rPr>
-        <w:t>src/preprocessing.py | Cleaning, chunking, splitting, and fine-tuning data creation.</w:t>
-      </w:r>
-    </w:p>
-    <w:p>
-      <w:pPr>
-        <w:spacing w:after="40"/>
-        <w:ind w:left="173"/>
-      </w:pPr>
-      <w:r>
-        <w:rPr>
-          <w:sz w:val="18"/>
-        </w:rPr>
-        <w:t>src/vector_store.py | SQLite metadata storage and ChromaDB vector indexing.</w:t>
-      </w:r>
-    </w:p>
-    <w:p>
-      <w:pPr>
-        <w:spacing w:after="40"/>
-        <w:ind w:left="173"/>
-      </w:pPr>
-      <w:r>
-        <w:rPr>
-          <w:sz w:val="18"/>
-        </w:rPr>
-        <w:t>src/rag_pipeline.py | RAG prompt construction and FLAN-T5 generation.</w:t>
-      </w:r>
-    </w:p>
-    <w:p>
-      <w:pPr>
-        <w:spacing w:after="40"/>
-        <w:ind w:left="173"/>
-      </w:pPr>
-      <w:r>
-        <w:rPr>
-          <w:sz w:val="18"/>
-        </w:rPr>
-        <w:t>src/agents.py | Multi-agent components and guardrails.</w:t>
-      </w:r>
-    </w:p>
-    <w:p>
-      <w:pPr>
-        <w:spacing w:after="40"/>
-        <w:ind w:left="173"/>
-      </w:pPr>
-      <w:r>
-        <w:rPr>
-          <w:sz w:val="18"/>
-        </w:rPr>
-        <w:t>src/evaluation.py | BLEU, ROUGE, and BERTScore metric functions.</w:t>
-      </w:r>
-    </w:p>
-    <w:p>
-      <w:pPr>
-        <w:spacing w:after="40"/>
-        <w:ind w:left="173"/>
-      </w:pPr>
-      <w:r>
-        <w:rPr>
-          <w:sz w:val="18"/>
-        </w:rPr>
-        <w:t>src/baseline_eval.py | Final model comparison controller.</w:t>
-      </w:r>
-    </w:p>
-    <w:p>
-      <w:pPr>
-        <w:spacing w:after="40"/>
-        <w:ind w:left="173"/>
-      </w:pPr>
-      <w:r>
-        <w:rPr>
-          <w:sz w:val="18"/>
-        </w:rPr>
-        <w:t>app.py | Streamlit frontend.</w:t>
-      </w:r>
-    </w:p>
-    <w:p/>
     <w:p>
       <w:pPr>
         <w:pStyle w:val="Heading2"/>

</xml_diff>